<commit_message>
chore: update lookup ui
</commit_message>
<xml_diff>
--- a/docs/Topic 61.docx
+++ b/docs/Topic 61.docx
@@ -1093,6 +1093,15 @@
       </w:pPr>
       <w:r>
         <w:t>9.1.2 Structured P2P Networks</w:t>
+      </w:r>
+      <w:r>
+        <w:t xml:space="preserve"> (</w:t>
+      </w:r>
+      <w:r>
+        <w:t>Özsu and Valduriez theory</w:t>
+      </w:r>
+      <w:r>
+        <w:t>)</w:t>
       </w:r>
     </w:p>
     <w:p>
@@ -4298,7 +4307,6 @@
   <w:style w:type="character" w:default="1" w:styleId="DefaultParagraphFont">
     <w:name w:val="Default Paragraph Font"/>
     <w:uiPriority w:val="1"/>
-    <w:semiHidden/>
     <w:unhideWhenUsed/>
   </w:style>
   <w:style w:type="table" w:default="1" w:styleId="TableNormal">

</xml_diff>